<commit_message>
docs: update cover page and certificate with names of Dr. Rajesh RM & Dr. S. Anupama Kumar
</commit_message>
<xml_diff>
--- a/reports/SEE Report Template.docx
+++ b/reports/SEE Report Template.docx
@@ -453,87 +453,23 @@
           </w:tcPr>
           <w:p>
             <w:pPr>
-              <w:pStyle w:val="Normal"/>
+              <w:spacing w:before="80" w:after="80" w:line="276" w:lineRule="auto"/>
               <w:jc w:val="center"/>
-              <w:rPr/>
             </w:pPr>
+            <w:r/>
             <w:r>
               <w:rPr>
                 <w:rFonts w:ascii="Times New Roman" w:hAnsi="Times New Roman"/>
                 <w:b/>
                 <w:sz w:val="22"/>
               </w:rPr>
-              <w:t>Faculty Guide:</w:t>
+              <w:t>Faculty Guides:</w:t>
               <w:br/>
-              <w:t xml:space="preserve">Dr. </w:t>
-            </w:r>
-            <w:r>
-              <w:rPr>
-                <w:rFonts w:ascii="Times New Roman" w:hAnsi="Times New Roman"/>
-                <w:b/>
-                <w:sz w:val="22"/>
-              </w:rPr>
-              <w:t>Rajesh R M</w:t>
-            </w:r>
-            <w:r>
-              <w:rPr>
-                <w:rFonts w:ascii="Times New Roman" w:hAnsi="Times New Roman"/>
-                <w:b/>
-                <w:sz w:val="22"/>
-              </w:rPr>
+              <w:t>Dr. Rajesh RM, Assistant Professor</w:t>
               <w:br/>
-              <w:t xml:space="preserve">Assistant Professor, Department of AIML    </w:t>
+              <w:t>Dr. S. Anupama Kumar, Associate Professor</w:t>
               <w:br/>
-              <w:t xml:space="preserve"> Dr. </w:t>
-            </w:r>
-            <w:r>
-              <w:rPr>
-                <w:rFonts w:ascii="Times New Roman" w:hAnsi="Times New Roman"/>
-                <w:b/>
-                <w:sz w:val="22"/>
-              </w:rPr>
-              <w:t>S. Anupama Kumar</w:t>
-            </w:r>
-            <w:r>
-              <w:rPr>
-                <w:rFonts w:ascii="Times New Roman" w:hAnsi="Times New Roman"/>
-                <w:b/>
-                <w:sz w:val="22"/>
-              </w:rPr>
-              <w:br/>
-              <w:t>Ass</w:t>
-            </w:r>
-            <w:r>
-              <w:rPr>
-                <w:rFonts w:ascii="Times New Roman" w:hAnsi="Times New Roman"/>
-                <w:b/>
-                <w:sz w:val="22"/>
-              </w:rPr>
-              <w:t>ociate</w:t>
-            </w:r>
-            <w:r>
-              <w:rPr>
-                <w:rFonts w:ascii="Times New Roman" w:hAnsi="Times New Roman"/>
-                <w:b/>
-                <w:sz w:val="22"/>
-              </w:rPr>
-              <w:t xml:space="preserve"> Professor, Department of AIML</w:t>
-            </w:r>
-          </w:p>
-          <w:p>
-            <w:pPr>
-              <w:pStyle w:val="Normal"/>
-              <w:spacing w:before="0" w:after="200"/>
-              <w:jc w:val="center"/>
-              <w:rPr/>
-            </w:pPr>
-            <w:r>
-              <w:rPr>
-                <w:rFonts w:ascii="Times New Roman" w:hAnsi="Times New Roman"/>
-                <w:b/>
-                <w:sz w:val="22"/>
-              </w:rPr>
-              <w:t>RV College of Engineering, Bengaluru</w:t>
+              <w:t>Department of AIML, RV College of Engineering, Bengaluru</w:t>
             </w:r>
           </w:p>
         </w:tc>
@@ -1003,13 +939,14 @@
           <w:szCs w:val="24"/>
         </w:rPr>
       </w:pPr>
+      <w:r/>
       <w:r>
         <w:rPr>
           <w:rFonts w:ascii="Times New Roman" w:hAnsi="Times New Roman"/>
           <w:b/>
           <w:sz w:val="22"/>
         </w:rPr>
-        <w:t>Faculty Name: __________________</w:t>
+        <w:t>Faculty Guides: Dr. Rajesh RM / Dr. S. Anupama Kumar</w:t>
       </w:r>
     </w:p>
     <w:p>

</xml_diff>